<commit_message>
Indikator Proksi bisa ditambahkan Tim SAKIP per IKU (pengganti blok_sakip)
- Kartu "Indikator Proksi" + Tambah Proksi di Detail Verifikasi, disimpan per IKU per triwulan
- Notula: {{blok_proksi}} dengan baris {{proksi_uraian}}/{{proksi_target}}/{{proksi_realisasi}}
  untuk IKU apa pun yang punya proksi; penanda boleh paragraf dalam sel atau baris tabel
- blok_sakip/target_proksi/realisasi_proksi tidak dipakai lagi; template bawaan & panduan diperbarui

Co-Authored-By: Claude Opus 5.5 <noreply@anthropic.com>
</commit_message>
<xml_diff>
--- a/template_notula/SIPINTER_Template_Bagian_I_Mesin.docx
+++ b/template_notula/SIPINTER_Template_Bagian_I_Mesin.docx
@@ -886,7 +886,7 @@
           </w:tcPr>
           <w:p>
             <w:r>
-              <w:t>{{blok_sakip}}</w:t>
+              <w:t>{{blok_proksi}}</w:t>
             </w:r>
           </w:p>
         </w:tc>
@@ -904,7 +904,7 @@
                 <w:b/>
                 <w:i w:val="0"/>
               </w:rPr>
-              <w:t>Jelaskan mengenai persentase monitoring capaian kinerja triwulanan yang terlaksana tepat waktu :</w:t>
+              <w:t>Capaian IKU ini dijelaskan melalui indikator proksi berikut :</w:t>
             </w:r>
           </w:p>
         </w:tc>
@@ -978,10 +978,10 @@
             <w:r>
               <w:rPr>
                 <w:b w:val="0"/>
-                <w:i/>
-                <w:color w:val="C00000"/>
+                <w:i w:val="0"/>
+                <w:color w:val="000000"/>
               </w:rPr>
-              <w:t>Persentase monitoring capaian kinerja triwulanan yang terlaksana tepat waktu</w:t>
+              <w:t>{{proksi_uraian}}</w:t>
             </w:r>
           </w:p>
         </w:tc>
@@ -998,7 +998,7 @@
                 <w:i w:val="0"/>
                 <w:color w:val="000000"/>
               </w:rPr>
-              <w:t>{{target_proksi}}</w:t>
+              <w:t>{{proksi_target}}</w:t>
             </w:r>
           </w:p>
         </w:tc>
@@ -1014,7 +1014,7 @@
                 <w:i w:val="0"/>
                 <w:color w:val="000000"/>
               </w:rPr>
-              <w:t>{{realisasi_proksi}}</w:t>
+              <w:t>{{proksi_realisasi}}</w:t>
             </w:r>
           </w:p>
         </w:tc>
@@ -1027,7 +1027,7 @@
           </w:tcPr>
           <w:p>
             <w:r>
-              <w:t>{{/blok_sakip}}</w:t>
+              <w:t>{{/blok_proksi}}</w:t>
             </w:r>
           </w:p>
         </w:tc>

</xml_diff>